<commit_message>
fix(design): professional-word-output uses Source Serif 4 / Public Sans / JetBrains Mono (Inter and Arial are hard-banned); Word-safe fallbacks stated; reference.docx regenerated
Co-Authored-By: Claude Opus 5.5 <noreply@anthropic.com>
</commit_message>
<xml_diff>
--- a/skills/product-business/professional-word-output/templates/reference.docx
+++ b/skills/product-business/professional-word-output/templates/reference.docx
@@ -22,7 +22,7 @@
     </w:pPr>
     <w:r>
       <w:rPr>
-        <w:rFonts w:ascii="Calibri" w:hAnsi="Calibri" w:cs="Calibri"/>
+        <w:rFonts w:ascii="Public Sans" w:hAnsi="Public Sans" w:cs="Public Sans"/>
         <w:color w:val="595959"/>
         <w:sz w:val="18"/>
       </w:rPr>
@@ -30,7 +30,7 @@
     </w:r>
     <w:r>
       <w:rPr>
-        <w:rFonts w:ascii="Calibri" w:hAnsi="Calibri" w:cs="Calibri"/>
+        <w:rFonts w:ascii="Public Sans" w:hAnsi="Public Sans" w:cs="Public Sans"/>
         <w:color w:val="595959"/>
         <w:sz w:val="18"/>
       </w:rPr>
@@ -411,7 +411,7 @@
       <w:spacing w:before="0" w:after="120" w:line="276" w:lineRule="auto"/>
     </w:pPr>
     <w:rPr>
-      <w:rFonts w:ascii="Calibri" w:hAnsi="Calibri" w:cs="Calibri"/>
+      <w:rFonts w:ascii="Public Sans" w:hAnsi="Public Sans" w:cs="Public Sans"/>
       <w:b w:val="0"/>
       <w:color w:val="262626"/>
       <w:sz w:val="22"/>
@@ -480,7 +480,7 @@
       </w:pBdr>
     </w:pPr>
     <w:rPr>
-      <w:rFonts w:asciiTheme="majorHAnsi" w:eastAsiaTheme="majorEastAsia" w:hAnsiTheme="majorHAnsi" w:cstheme="majorBidi" w:ascii="Calibri Light" w:hAnsi="Calibri Light" w:cs="Calibri Light"/>
+      <w:rFonts w:asciiTheme="majorHAnsi" w:eastAsiaTheme="majorEastAsia" w:hAnsiTheme="majorHAnsi" w:cstheme="majorBidi" w:ascii="Source Serif 4" w:hAnsi="Source Serif 4" w:cs="Source Serif 4"/>
       <w:b/>
       <w:bCs/>
       <w:color w:val="1F3864"/>
@@ -504,7 +504,7 @@
       <w:outlineLvl w:val="1"/>
     </w:pPr>
     <w:rPr>
-      <w:rFonts w:asciiTheme="majorHAnsi" w:eastAsiaTheme="majorEastAsia" w:hAnsiTheme="majorHAnsi" w:cstheme="majorBidi" w:ascii="Calibri Light" w:hAnsi="Calibri Light" w:cs="Calibri Light"/>
+      <w:rFonts w:asciiTheme="majorHAnsi" w:eastAsiaTheme="majorEastAsia" w:hAnsiTheme="majorHAnsi" w:cstheme="majorBidi" w:ascii="Source Serif 4" w:hAnsi="Source Serif 4" w:cs="Source Serif 4"/>
       <w:b/>
       <w:bCs/>
       <w:color w:val="2E5D8A"/>
@@ -528,7 +528,7 @@
       <w:outlineLvl w:val="2"/>
     </w:pPr>
     <w:rPr>
-      <w:rFonts w:asciiTheme="majorHAnsi" w:eastAsiaTheme="majorEastAsia" w:hAnsiTheme="majorHAnsi" w:cstheme="majorBidi" w:ascii="Calibri" w:hAnsi="Calibri" w:cs="Calibri"/>
+      <w:rFonts w:asciiTheme="majorHAnsi" w:eastAsiaTheme="majorEastAsia" w:hAnsiTheme="majorHAnsi" w:cstheme="majorBidi" w:ascii="Public Sans" w:hAnsi="Public Sans" w:cs="Public Sans"/>
       <w:b/>
       <w:bCs/>
       <w:color w:val="4472C4"/>
@@ -552,7 +552,7 @@
       <w:outlineLvl w:val="3"/>
     </w:pPr>
     <w:rPr>
-      <w:rFonts w:asciiTheme="majorHAnsi" w:eastAsiaTheme="majorEastAsia" w:hAnsiTheme="majorHAnsi" w:cstheme="majorBidi" w:ascii="Calibri" w:hAnsi="Calibri" w:cs="Calibri"/>
+      <w:rFonts w:asciiTheme="majorHAnsi" w:eastAsiaTheme="majorEastAsia" w:hAnsiTheme="majorHAnsi" w:cstheme="majorBidi" w:ascii="Public Sans" w:hAnsi="Public Sans" w:cs="Public Sans"/>
       <w:b/>
       <w:bCs/>
       <w:i/>
@@ -771,7 +771,7 @@
       <w:contextualSpacing/>
     </w:pPr>
     <w:rPr>
-      <w:rFonts w:asciiTheme="majorHAnsi" w:eastAsiaTheme="majorEastAsia" w:hAnsiTheme="majorHAnsi" w:cstheme="majorBidi" w:ascii="Calibri Light" w:hAnsi="Calibri Light" w:cs="Calibri Light"/>
+      <w:rFonts w:asciiTheme="majorHAnsi" w:eastAsiaTheme="majorEastAsia" w:hAnsiTheme="majorHAnsi" w:cstheme="majorBidi" w:ascii="Source Serif 4" w:hAnsi="Source Serif 4" w:cs="Source Serif 4"/>
       <w:b/>
       <w:color w:val="1F3864"/>
       <w:spacing w:val="5"/>
@@ -810,7 +810,7 @@
       <w:spacing w:before="0" w:after="360"/>
     </w:pPr>
     <w:rPr>
-      <w:rFonts w:asciiTheme="majorHAnsi" w:eastAsiaTheme="majorEastAsia" w:hAnsiTheme="majorHAnsi" w:cstheme="majorBidi" w:ascii="Calibri Light" w:hAnsi="Calibri Light" w:cs="Calibri Light"/>
+      <w:rFonts w:asciiTheme="majorHAnsi" w:eastAsiaTheme="majorEastAsia" w:hAnsiTheme="majorHAnsi" w:cstheme="majorBidi" w:ascii="Source Serif 4" w:hAnsi="Source Serif 4" w:cs="Source Serif 4"/>
       <w:b w:val="0"/>
       <w:i/>
       <w:iCs/>
@@ -1216,7 +1216,7 @@
       <w:spacing w:line="240" w:lineRule="auto" w:before="40" w:after="160"/>
     </w:pPr>
     <w:rPr>
-      <w:rFonts w:ascii="Calibri" w:hAnsi="Calibri" w:cs="Calibri"/>
+      <w:rFonts w:ascii="Public Sans" w:hAnsi="Public Sans" w:cs="Public Sans"/>
       <w:b w:val="0"/>
       <w:bCs/>
       <w:color w:val="595959"/>

</xml_diff>